<commit_message>
Update diamond buying guide (GIA lab-grown format, ACCC link, shapes heading) and Italy guide (NOIM line)
</commit_message>
<xml_diff>
--- a/content/posts/diamond-buying-guide/diamond-buying-guide-draft.docx
+++ b/content/posts/diamond-buying-guide/diamond-buying-guide-draft.docx
@@ -109,7 +109,7 @@
           <w:sz w:val="18"/>
           <w:szCs w:val="18"/>
         </w:rPr>
-        <w:t xml:space="preserve">1. [[VERIFY]] items (1):</w:t>
+        <w:t xml:space="preserve">1. [[VERIFY]] items: none. The ACCC page is now linked (fact_46, read 29 Oct 2026).</w:t>
       </w:r>
     </w:p>
     <w:p>
@@ -118,7 +118,7 @@
           <w:sz w:val="18"/>
           <w:szCs w:val="18"/>
         </w:rPr>
-        <w:t xml:space="preserve">   - Australian Consumer Law: confirm on accc.gov.au that the ACL prohibits misleading or deceptive conduct, including how a product is described, and link that page in 'What Australian consumer law expects' (fact_31). One marker in the body; not in any FAQ.</w:t>
+        <w:t xml:space="preserve">2. Nic sign-off on prices: none (no prices printed). Only figure for Nic: the ABF duty-free allowance of AUD900 is a government limit, not a price; confirm the post may state it, and re-check the figure on abf.gov.au at publish (it is written "as at October 2026", in the body and the FAQ).</w:t>
       </w:r>
     </w:p>
     <w:p>
@@ -127,7 +127,7 @@
           <w:sz w:val="18"/>
           <w:szCs w:val="18"/>
         </w:rPr>
-        <w:t xml:space="preserve">2. Nic sign-off on prices: none (no prices printed). Only figure for Nic: the ABF duty-free allowance of AUD900 is a government limit, not a price; confirm the post may state it, and re-check the figure on abf.gov.au at publish (it is written "as at October 2026", in the body and the FAQ).</w:t>
+        <w:t xml:space="preserve">3. Image slots needed (9, none approved yet; alt and caption to add when approved). The grading report image must be a fictional SAMPLE mock-up made in Canva, never a real report or lab logo. AI images are illustrative only, labelled "Illustrative image", and only if the person approves.</w:t>
       </w:r>
     </w:p>
     <w:p>
@@ -136,7 +136,7 @@
           <w:sz w:val="18"/>
           <w:szCs w:val="18"/>
         </w:rPr>
-        <w:t xml:space="preserve">3. Image slots needed (9, none approved yet; alt and caption to add when approved). The grading report image must be a fictional SAMPLE mock-up made in Canva, never a real report or lab logo. AI images are illustrative only, labelled "Illustrative image", and only if the person approves.</w:t>
+        <w:t xml:space="preserve">   - featured (needed, licensed photography preferred; AI only if approved, labelled "Illustrative image")</w:t>
       </w:r>
     </w:p>
     <w:p>
@@ -145,7 +145,7 @@
           <w:sz w:val="18"/>
           <w:szCs w:val="18"/>
         </w:rPr>
-        <w:t xml:space="preserve">   - featured (needed, licensed photography preferred; AI only if approved, labelled "Illustrative image")</w:t>
+        <w:t xml:space="preserve">   - cut (needed, best built as own brand diagram in Canva; never copy GIA or IGI diagrams; AI stone artwork only if approved, labelled "Illustrative image")</w:t>
       </w:r>
     </w:p>
     <w:p>
@@ -154,7 +154,7 @@
           <w:sz w:val="18"/>
           <w:szCs w:val="18"/>
         </w:rPr>
-        <w:t xml:space="preserve">   - cut (needed, best built as own brand diagram in Canva; never copy GIA or IGI diagrams; AI stone artwork only if approved, labelled "Illustrative image")</w:t>
+        <w:t xml:space="preserve">   - colour (needed, best built as own brand diagram in Canva; never copy GIA or IGI diagrams; AI stone artwork only if approved, labelled "Illustrative image")</w:t>
       </w:r>
     </w:p>
     <w:p>
@@ -163,7 +163,7 @@
           <w:sz w:val="18"/>
           <w:szCs w:val="18"/>
         </w:rPr>
-        <w:t xml:space="preserve">   - colour (needed, best built as own brand diagram in Canva; never copy GIA or IGI diagrams; AI stone artwork only if approved, labelled "Illustrative image")</w:t>
+        <w:t xml:space="preserve">   - clarity (needed, best built as own brand diagram in Canva; never copy GIA or IGI diagrams; AI stone artwork only if approved, labelled "Illustrative image")</w:t>
       </w:r>
     </w:p>
     <w:p>
@@ -172,7 +172,7 @@
           <w:sz w:val="18"/>
           <w:szCs w:val="18"/>
         </w:rPr>
-        <w:t xml:space="preserve">   - clarity (needed, best built as own brand diagram in Canva; never copy GIA or IGI diagrams; AI stone artwork only if approved, labelled "Illustrative image")</w:t>
+        <w:t xml:space="preserve">   - carat (needed, licensed photo preferred; AI only if approved, labelled "Illustrative image"; no logos, never copy GIA or IGI diagrams)</w:t>
       </w:r>
     </w:p>
     <w:p>
@@ -181,7 +181,7 @@
           <w:sz w:val="18"/>
           <w:szCs w:val="18"/>
         </w:rPr>
-        <w:t xml:space="preserve">   - carat (needed, licensed photo preferred; AI only if approved, labelled "Illustrative image"; no logos, never copy GIA or IGI diagrams)</w:t>
+        <w:t xml:space="preserve">   - shape (needed, licensed photo preferred; AI only if approved, labelled "Illustrative image"; no logos, never copy GIA or IGI diagrams)</w:t>
       </w:r>
     </w:p>
     <w:p>
@@ -190,7 +190,7 @@
           <w:sz w:val="18"/>
           <w:szCs w:val="18"/>
         </w:rPr>
-        <w:t xml:space="preserve">   - shape (needed, licensed photo preferred; AI only if approved, labelled "Illustrative image"; no logos, never copy GIA or IGI diagrams)</w:t>
+        <w:t xml:space="preserve">   - grading_report (needed, fictional SAMPLE mock-up built in Canva by the team: invented layout, 'SAMPLE' across it, obviously fake report number; never a real GIA or IGI report, never a lab name or logo, never a copy of either lab's layout; not AI)</w:t>
       </w:r>
     </w:p>
     <w:p>
@@ -199,7 +199,7 @@
           <w:sz w:val="18"/>
           <w:szCs w:val="18"/>
         </w:rPr>
-        <w:t xml:space="preserve">   - grading_report (needed, fictional SAMPLE mock-up built in Canva by the team: invented layout, 'SAMPLE' across it, obviously fake report number; never a real GIA or IGI report, never a lab name or logo, never a copy of either lab's layout; not AI)</w:t>
+        <w:t xml:space="preserve">   - lab_vs_natural (needed, licensed photo preferred; AI only if approved, labelled "Illustrative image"; no logos, never copy GIA or IGI diagrams)</w:t>
       </w:r>
     </w:p>
     <w:p>
@@ -208,7 +208,7 @@
           <w:sz w:val="18"/>
           <w:szCs w:val="18"/>
         </w:rPr>
-        <w:t xml:space="preserve">   - lab_vs_natural (needed, licensed photo preferred; AI only if approved, labelled "Illustrative image"; no logos, never copy GIA or IGI diagrams)</w:t>
+        <w:t xml:space="preserve">   - travel (needed, licensed photo preferred; AI only if approved, labelled "Illustrative image"; no logos, never copy GIA or IGI diagrams)</w:t>
       </w:r>
     </w:p>
     <w:p>
@@ -217,7 +217,7 @@
           <w:sz w:val="18"/>
           <w:szCs w:val="18"/>
         </w:rPr>
-        <w:t xml:space="preserve">   - travel (needed, licensed photo preferred; AI only if approved, labelled "Illustrative image"; no logos, never copy GIA or IGI diagrams)</w:t>
+        <w:t xml:space="preserve">4. Fact spot-check: some lab-site facts (GIA and IGI report check, inscriptions, lab-grown reporting) came from search summaries, so spot-check them against the lab sites before publishing.</w:t>
       </w:r>
     </w:p>
     <w:p>
@@ -226,16 +226,7 @@
           <w:sz w:val="18"/>
           <w:szCs w:val="18"/>
         </w:rPr>
-        <w:t xml:space="preserve">4. Fact spot-check: some lab-site facts (GIA and IGI report check, inscriptions, lab-grown reporting) came from search summaries, so spot-check them against the lab sites before publishing.</w:t>
-      </w:r>
-    </w:p>
-    <w:p>
-      <w:r>
-        <w:rPr>
-          <w:sz w:val="18"/>
-          <w:szCs w:val="18"/>
-        </w:rPr>
-        <w:t xml:space="preserve">5. Internal link dependency: publish /style-advice/engagement-ring-styles first (linked from 'Diamond shapes and how each changes the 4Cs').</w:t>
+        <w:t xml:space="preserve">5. Internal link dependency: publish /style-advice/engagement-ring-styles, /style-advice/engagement-ring-cuts and /style-advice/lab-grown-diamonds first (linked from 'How shape changes the 4Cs').</w:t>
       </w:r>
     </w:p>
     <w:p>
@@ -417,7 +408,7 @@
       <w:r>
         <w:t xml:space="preserve">It also covers what the Kimberley Process does and does not promise, and buying or carrying a stone abroad. A </w:t>
       </w:r>
-      <w:hyperlink w:history="1" r:id="rIdk47lqpsjy93jpwwaeg4lz">
+      <w:hyperlink w:history="1" r:id="rIdgtmd3jf5rnonfzhc3ueu-">
         <w:r>
           <w:rPr>
             <w:rStyle w:val="Hyperlink"/>
@@ -494,7 +485,7 @@
       <w:r>
         <w:t xml:space="preserve">For the money side, see our guide on </w:t>
       </w:r>
-      <w:hyperlink w:history="1" r:id="rIdmbngxz77epaycdf2tpnps">
+      <w:hyperlink w:history="1" r:id="rIdq__ardyooe_iwqx6m6wag">
         <w:r>
           <w:rPr>
             <w:rStyle w:val="Hyperlink"/>
@@ -628,7 +619,7 @@
       <w:r>
         <w:t xml:space="preserve">According to </w:t>
       </w:r>
-      <w:hyperlink w:history="1" r:id="rId5ifirgw-tybwbvfioxeqc">
+      <w:hyperlink w:history="1" r:id="rIdjoy0tpp74umijygq9i-mu">
         <w:r>
           <w:rPr>
             <w:rStyle w:val="Hyperlink"/>
@@ -1034,7 +1025,7 @@
         <w:pStyle w:val="Heading1"/>
       </w:pPr>
       <w:r>
-        <w:t xml:space="preserve">Diamond shapes and how each changes the 4Cs</w:t>
+        <w:t xml:space="preserve">How shape changes the 4Cs</w:t>
       </w:r>
     </w:p>
     <w:tbl>
@@ -1101,7 +1092,7 @@
       <w:r>
         <w:t xml:space="preserve">The main shapes you will be shown are round, oval, cushion, emerald, pear, princess, radiant, marquise and Asscher. For the overall look of each and who it tends to suit, see our guide to </w:t>
       </w:r>
-      <w:hyperlink w:history="1" r:id="rId1w6denubsnjtbyzye3x-c">
+      <w:hyperlink w:history="1" r:id="rIdtisu-qtizrjjgxgvc9pba">
         <w:r>
           <w:rPr>
             <w:rStyle w:val="Hyperlink"/>
@@ -1112,7 +1103,20 @@
         </w:r>
       </w:hyperlink>
       <w:r>
-        <w:t xml:space="preserve">. Here, the question is narrower: how shape changes the way you read the 4Cs.</w:t>
+        <w:t xml:space="preserve">. Here, the question is narrower: how shape changes the way you read the 4Cs. For how each shape looks on the hand, see our guide to </w:t>
+      </w:r>
+      <w:hyperlink w:history="1" r:id="rIdqdhmmm4_gfgwj2_ritd64">
+        <w:r>
+          <w:rPr>
+            <w:rStyle w:val="Hyperlink"/>
+            <w:b w:val="false"/>
+            <w:bCs w:val="false"/>
+          </w:rPr>
+          <w:t xml:space="preserve">engagement ring cuts and the hands they flatter</w:t>
+        </w:r>
+      </w:hyperlink>
+      <w:r>
+        <w:t xml:space="preserve">.</w:t>
       </w:r>
     </w:p>
     <w:p>
@@ -1146,7 +1150,7 @@
       <w:r>
         <w:t xml:space="preserve">Pointed shapes need care for another reason. Stones with exposed points or very thin girdles, such as pears and marquises, are more prone to chipping, and V-shaped prongs are used to protect pointed corners. A diamond rates 10 on the Mohs scale for scratch resistance, but a hard knock can still cleave or fracture it. Our guide to </w:t>
       </w:r>
-      <w:hyperlink w:history="1" r:id="rId9pt6dpslaaue3nn6_zzag">
+      <w:hyperlink w:history="1" r:id="rIdxcpjzsiovd99us1_9vg2g">
         <w:r>
           <w:rPr>
             <w:rStyle w:val="Hyperlink"/>
@@ -1183,7 +1187,7 @@
       <w:r>
         <w:t xml:space="preserve">Still gathering ideas? </w:t>
       </w:r>
-      <w:hyperlink w:history="1" r:id="rIdwlw9k8zjybsulks0243rt">
+      <w:hyperlink w:history="1" r:id="rIdo5wwxom8zfrgzc378h0zl">
         <w:r>
           <w:rPr>
             <w:rStyle w:val="Hyperlink"/>
@@ -1444,7 +1448,20 @@
         <w:spacing w:after="140"/>
       </w:pPr>
       <w:r>
-        <w:t xml:space="preserve">Both GIA and IGI issue reports for laboratory-grown diamonds, and both inscribe origin on the stone as described above. Do not assume a lab-grown report reads like a natural one; check the lab's own site for how it currently reports lab-grown stones.</w:t>
+        <w:t xml:space="preserve">Both GIA and IGI issue reports for laboratory-grown diamonds, and both inscribe origin on the stone as described above. Since 1 October 2025, GIA describes colourless to near-colourless lab-grown stones as "Premium" or "Standard" rather than on the colour and clarity scales it uses for natural diamonds, and inscribes the girdle "Laboratory-Grown" with the assessment number. GIA lab-grown reports issued under the earlier format remain valid. For the full comparison, see </w:t>
+      </w:r>
+      <w:hyperlink w:history="1" r:id="rIdk1uodcsf3ds90ca-ffvw_">
+        <w:r>
+          <w:rPr>
+            <w:rStyle w:val="Hyperlink"/>
+            <w:b w:val="false"/>
+            <w:bCs w:val="false"/>
+          </w:rPr>
+          <w:t xml:space="preserve">are lab-grown diamonds worth it?</w:t>
+        </w:r>
+      </w:hyperlink>
+      <w:r>
+        <w:t xml:space="preserve">.</w:t>
       </w:r>
     </w:p>
     <w:p>
@@ -1468,15 +1485,18 @@
         <w:spacing w:after="140"/>
       </w:pPr>
       <w:r>
-        <w:t xml:space="preserve">In general terms, Australian Consumer Law prohibits misleading or deceptive conduct, which includes how a product is described to you </w:t>
-      </w:r>
-      <w:r>
-        <w:rPr>
-          <w:highlight w:val="yellow"/>
-          <w:highlightCs w:val="yellow"/>
-        </w:rPr>
-        <w:t xml:space="preserve">[[VERIFY: confirm on accc.gov.au and link that page here (fact_31)]]</w:t>
-      </w:r>
+        <w:t xml:space="preserve">The ACCC says any claim a business makes about its products, including in advertising, online and in what staff tell you, must be </w:t>
+      </w:r>
+      <w:hyperlink w:history="1" r:id="rId_lxb3bgdhh3bxy-x8yftk">
+        <w:r>
+          <w:rPr>
+            <w:rStyle w:val="Hyperlink"/>
+            <w:b w:val="false"/>
+            <w:bCs w:val="false"/>
+          </w:rPr>
+          <w:t xml:space="preserve">accurate, truthful and based on reasonable grounds</w:t>
+        </w:r>
+      </w:hyperlink>
       <w:r>
         <w:t xml:space="preserve">. As at October 2026, we found no Australian guidance written specifically for lab-grown diamonds.</w:t>
       </w:r>
@@ -1504,7 +1524,7 @@
       <w:r>
         <w:t xml:space="preserve">In practice, it rarely changes how a stone looks. The common worry is haziness, but according to </w:t>
       </w:r>
-      <w:hyperlink w:history="1" r:id="rIdxahxov-mwsjtk6mffolkj">
+      <w:hyperlink w:history="1" r:id="rId-aoksqqojynlrmn7qydus">
         <w:r>
           <w:rPr>
             <w:rStyle w:val="Hyperlink"/>
@@ -1541,7 +1561,7 @@
       <w:r>
         <w:t xml:space="preserve">The Kimberley Process is an international initiative and intergovernmental forum set up to keep conflict diamonds out of the legitimate trade. Its certification scheme came into force in 2003 and covers rough diamonds. Under it, participating countries may trade rough diamonds only with other participants, and every export must carry a valid certificate. </w:t>
       </w:r>
-      <w:hyperlink w:history="1" r:id="rIdxkeecjcryduwv8oqsbggv">
+      <w:hyperlink w:history="1" r:id="rIdm85bpqe4d-lkowtluanbe">
         <w:r>
           <w:rPr>
             <w:rStyle w:val="Hyperlink"/>
@@ -1707,7 +1727,7 @@
       <w:r>
         <w:t xml:space="preserve">Buying the stone abroad, or carrying it to a proposal overseas, is straightforward with the right paperwork and insurance in place. If you are still planning the moment itself, our step-by-step guide on </w:t>
       </w:r>
-      <w:hyperlink w:history="1" r:id="rIdshdnazp-2twc1vnoidywr">
+      <w:hyperlink w:history="1" r:id="rIdhgodtie7ro_fngadknslb">
         <w:r>
           <w:rPr>
             <w:rStyle w:val="Hyperlink"/>
@@ -1736,7 +1756,7 @@
       <w:r>
         <w:t xml:space="preserve">As at October 2026, the </w:t>
       </w:r>
-      <w:hyperlink w:history="1" r:id="rIdj6nagodsolpfl2qdxxker">
+      <w:hyperlink w:history="1" r:id="rIdfnaiufddz2i8x9teplnna">
         <w:r>
           <w:rPr>
             <w:rStyle w:val="Hyperlink"/>
@@ -2064,7 +2084,7 @@
       <w:pPr>
         <w:spacing w:after="140"/>
       </w:pPr>
-      <w:hyperlink w:history="1" r:id="rIdg19-yh3swta6ydz8pjep_">
+      <w:hyperlink w:history="1" r:id="rIdlm3i8whxjgzlu4vnxzqvd">
         <w:r>
           <w:rPr>
             <w:rStyle w:val="Hyperlink"/>
@@ -2090,7 +2110,7 @@
       <w:r>
         <w:t xml:space="preserve">If the proposal or the wedding is heading overseas, </w:t>
       </w:r>
-      <w:hyperlink w:history="1" r:id="rId51ja5bfz2dnpvx7p-ocii">
+      <w:hyperlink w:history="1" r:id="rIdeca_jfgn0vxbpdett00lo">
         <w:r>
           <w:rPr>
             <w:rStyle w:val="Hyperlink"/>

</xml_diff>